<commit_message>
feat: add kop surat selection and duplicate functionality to surket kinerja ta module
</commit_message>
<xml_diff>
--- a/app/Views/admin/kontrak/surket_kinerja_ta_template.docx
+++ b/app/Views/admin/kontrak/surket_kinerja_ta_template.docx
@@ -283,6 +283,7 @@
     <w:tbl>
       <w:tblPr>
         <w:tblW w:w="9639" w:type="dxa"/>
+        <w:tblInd w:w="567" w:type="dxa"/>
         <w:tblBorders>
           <w:top w:val="single" w:sz="4" w:space="0" w:color="auto"/>
           <w:left w:val="single" w:sz="4" w:space="0" w:color="auto"/>
@@ -724,6 +725,7 @@
     <w:tbl>
       <w:tblPr>
         <w:tblW w:w="9306" w:type="dxa"/>
+        <w:tblInd w:w="567" w:type="dxa"/>
         <w:tblBorders>
           <w:top w:val="single" w:sz="4" w:space="0" w:color="auto"/>
           <w:left w:val="single" w:sz="4" w:space="0" w:color="auto"/>
@@ -1162,154 +1164,19 @@
       <w:pPr>
         <w:spacing w:after="80"/>
       </w:pPr>
-      <w:proofErr w:type="spellStart"/>
       <w:r>
         <w:rPr>
-          <w:sz w:val="20"/>
-          <w:szCs w:val="20"/>
-        </w:rPr>
-        <w:t>telah</w:t>
-      </w:r>
-      <w:proofErr w:type="spellEnd"/>
-      <w:r>
-        <w:rPr>
-          <w:sz w:val="20"/>
-          <w:szCs w:val="20"/>
-        </w:rPr>
-        <w:t xml:space="preserve"> </w:t>
-      </w:r>
-      <w:proofErr w:type="spellStart"/>
-      <w:r>
-        <w:rPr>
-          <w:sz w:val="20"/>
-          <w:szCs w:val="20"/>
-        </w:rPr>
-        <w:t>melaksanakan</w:t>
-      </w:r>
-      <w:proofErr w:type="spellEnd"/>
-      <w:r>
-        <w:rPr>
-          <w:sz w:val="20"/>
-          <w:szCs w:val="20"/>
-        </w:rPr>
-        <w:t xml:space="preserve"> </w:t>
-      </w:r>
-      <w:proofErr w:type="spellStart"/>
-      <w:r>
-        <w:rPr>
-          <w:sz w:val="20"/>
-          <w:szCs w:val="20"/>
-        </w:rPr>
-        <w:t>pekerjaan</w:t>
-      </w:r>
-      <w:proofErr w:type="spellEnd"/>
-      <w:r>
-        <w:rPr>
-          <w:sz w:val="20"/>
-          <w:szCs w:val="20"/>
-        </w:rPr>
-        <w:t xml:space="preserve"> </w:t>
-      </w:r>
-      <w:proofErr w:type="spellStart"/>
-      <w:r>
-        <w:rPr>
-          <w:sz w:val="20"/>
-          <w:szCs w:val="20"/>
-        </w:rPr>
-        <w:t>jasa</w:t>
-      </w:r>
-      <w:proofErr w:type="spellEnd"/>
-      <w:r>
-        <w:rPr>
-          <w:sz w:val="20"/>
-          <w:szCs w:val="20"/>
-        </w:rPr>
-        <w:t xml:space="preserve"> </w:t>
-      </w:r>
-      <w:proofErr w:type="spellStart"/>
-      <w:r>
-        <w:rPr>
-          <w:sz w:val="20"/>
-          <w:szCs w:val="20"/>
-        </w:rPr>
-        <w:t>konsultansi</w:t>
-      </w:r>
-      <w:proofErr w:type="spellEnd"/>
-      <w:r>
-        <w:rPr>
-          <w:sz w:val="20"/>
-          <w:szCs w:val="20"/>
-        </w:rPr>
-        <w:t xml:space="preserve"> </w:t>
-      </w:r>
-      <w:proofErr w:type="spellStart"/>
-      <w:r>
-        <w:rPr>
-          <w:sz w:val="20"/>
-          <w:szCs w:val="20"/>
-        </w:rPr>
-        <w:t>konstruksi</w:t>
-      </w:r>
-      <w:proofErr w:type="spellEnd"/>
-      <w:r>
-        <w:rPr>
-          <w:sz w:val="20"/>
-          <w:szCs w:val="20"/>
-        </w:rPr>
-        <w:t xml:space="preserve"> </w:t>
-      </w:r>
-      <w:proofErr w:type="spellStart"/>
-      <w:r>
-        <w:rPr>
-          <w:sz w:val="20"/>
-          <w:szCs w:val="20"/>
-        </w:rPr>
-        <w:t>dengan</w:t>
-      </w:r>
-      <w:proofErr w:type="spellEnd"/>
-      <w:r>
-        <w:rPr>
-          <w:sz w:val="20"/>
-          <w:szCs w:val="20"/>
-        </w:rPr>
-        <w:t xml:space="preserve"> data </w:t>
-      </w:r>
-      <w:proofErr w:type="spellStart"/>
-      <w:r>
-        <w:rPr>
-          <w:sz w:val="20"/>
-          <w:szCs w:val="20"/>
-        </w:rPr>
-        <w:t>sebagai</w:t>
-      </w:r>
-      <w:proofErr w:type="spellEnd"/>
-      <w:r>
-        <w:rPr>
-          <w:sz w:val="20"/>
-          <w:szCs w:val="20"/>
-        </w:rPr>
-        <w:t xml:space="preserve"> </w:t>
-      </w:r>
-      <w:proofErr w:type="spellStart"/>
-      <w:r>
-        <w:rPr>
-          <w:sz w:val="20"/>
-          <w:szCs w:val="20"/>
-        </w:rPr>
-        <w:t>berikut</w:t>
-      </w:r>
-      <w:proofErr w:type="spellEnd"/>
-      <w:r>
-        <w:rPr>
-          <w:sz w:val="20"/>
-          <w:szCs w:val="20"/>
-        </w:rPr>
-        <w:t>:</w:t>
+          <w:rFonts w:ascii="Arial" w:hAnsi="Arial" w:cs="Arial"/>
+          <w:sz w:val="20"/>
+          <w:szCs w:val="20"/>
+        </w:rPr>
+        <w:t>${teks_pengantar_pekerjaan}</w:t>
       </w:r>
     </w:p>
     <w:tbl>
       <w:tblPr>
         <w:tblW w:w="9781" w:type="dxa"/>
+        <w:tblInd w:w="567" w:type="dxa"/>
         <w:tblBorders>
           <w:top w:val="single" w:sz="4" w:space="0" w:color="auto"/>
           <w:left w:val="single" w:sz="4" w:space="0" w:color="auto"/>
@@ -2193,25 +2060,6 @@
         </w:rPr>
       </w:pPr>
     </w:p>
-    <w:p ns2:paraId="74405DD9" ns2:textId="34FFC310">
-      <w:pPr>
-        <w:spacing w:after="80"/>
-      </w:pPr>
-      <w:proofErr w:type="spellStart"/>
-      <w:proofErr w:type="spellEnd"/>
-      <w:proofErr w:type="spellStart"/>
-      <w:proofErr w:type="spellEnd"/>
-      <w:proofErr w:type="spellStart"/>
-      <w:proofErr w:type="spellEnd"/>
-      <w:r>
-        <w:rPr>
-          <w:rFonts w:ascii="Arial" w:hAnsi="Arial" w:cs="Arial"/>
-          <w:sz w:val="20"/>
-          <w:szCs w:val="20"/>
-        </w:rPr>
-        <w:t>Penilaian keseluruhan: ${penilaian_keseluruhan}</w:t>
-      </w:r>
-    </w:p>
     <w:p ns2:paraId="1B9DC6B6" ns2:textId="77777777">
       <w:pPr>
         <w:spacing w:after="200"/>
@@ -2231,325 +2079,13 @@
           <w:szCs w:val="20"/>
         </w:rPr>
       </w:pPr>
-      <w:proofErr w:type="spellStart"/>
       <w:r>
         <w:rPr>
-          <w:sz w:val="20"/>
-          <w:szCs w:val="20"/>
-        </w:rPr>
-        <w:t>Demikian</w:t>
-      </w:r>
-      <w:proofErr w:type="spellEnd"/>
-      <w:r>
-        <w:rPr>
-          <w:sz w:val="20"/>
-          <w:szCs w:val="20"/>
-        </w:rPr>
-        <w:t xml:space="preserve"> </w:t>
-      </w:r>
-      <w:proofErr w:type="spellStart"/>
-      <w:r>
-        <w:rPr>
-          <w:sz w:val="20"/>
-          <w:szCs w:val="20"/>
-        </w:rPr>
-        <w:t>surat</w:t>
-      </w:r>
-      <w:proofErr w:type="spellEnd"/>
-      <w:r>
-        <w:rPr>
-          <w:sz w:val="20"/>
-          <w:szCs w:val="20"/>
-        </w:rPr>
-        <w:t xml:space="preserve"> </w:t>
-      </w:r>
-      <w:proofErr w:type="spellStart"/>
-      <w:r>
-        <w:rPr>
-          <w:sz w:val="20"/>
-          <w:szCs w:val="20"/>
-        </w:rPr>
-        <w:t>keterangan</w:t>
-      </w:r>
-      <w:proofErr w:type="spellEnd"/>
-      <w:r>
-        <w:rPr>
-          <w:sz w:val="20"/>
-          <w:szCs w:val="20"/>
-        </w:rPr>
-        <w:t xml:space="preserve"> </w:t>
-      </w:r>
-      <w:proofErr w:type="spellStart"/>
-      <w:r>
-        <w:rPr>
-          <w:sz w:val="20"/>
-          <w:szCs w:val="20"/>
-        </w:rPr>
-        <w:t>ini</w:t>
-      </w:r>
-      <w:proofErr w:type="spellEnd"/>
-      <w:r>
-        <w:rPr>
-          <w:sz w:val="20"/>
-          <w:szCs w:val="20"/>
-        </w:rPr>
-        <w:t xml:space="preserve"> </w:t>
-      </w:r>
-      <w:proofErr w:type="spellStart"/>
-      <w:r>
-        <w:rPr>
-          <w:sz w:val="20"/>
-          <w:szCs w:val="20"/>
-        </w:rPr>
-        <w:t>dibuat</w:t>
-      </w:r>
-      <w:proofErr w:type="spellEnd"/>
-      <w:r>
-        <w:rPr>
-          <w:sz w:val="20"/>
-          <w:szCs w:val="20"/>
-        </w:rPr>
-        <w:t xml:space="preserve"> </w:t>
-      </w:r>
-      <w:proofErr w:type="spellStart"/>
-      <w:r>
-        <w:rPr>
-          <w:sz w:val="20"/>
-          <w:szCs w:val="20"/>
-        </w:rPr>
-        <w:t>dengan</w:t>
-      </w:r>
-      <w:proofErr w:type="spellEnd"/>
-      <w:r>
-        <w:rPr>
-          <w:sz w:val="20"/>
-          <w:szCs w:val="20"/>
-        </w:rPr>
-        <w:t xml:space="preserve"> </w:t>
-      </w:r>
-      <w:proofErr w:type="spellStart"/>
-      <w:r>
-        <w:rPr>
-          <w:sz w:val="20"/>
-          <w:szCs w:val="20"/>
-        </w:rPr>
-        <w:t>sebenarnya</w:t>
-      </w:r>
-      <w:proofErr w:type="spellEnd"/>
-      <w:r>
-        <w:rPr>
-          <w:sz w:val="20"/>
-          <w:szCs w:val="20"/>
-        </w:rPr>
-        <w:t xml:space="preserve"> </w:t>
-      </w:r>
-      <w:proofErr w:type="spellStart"/>
-      <w:r>
-        <w:rPr>
-          <w:sz w:val="20"/>
-          <w:szCs w:val="20"/>
-        </w:rPr>
-        <w:t>untuk</w:t>
-      </w:r>
-      <w:proofErr w:type="spellEnd"/>
-      <w:r>
-        <w:rPr>
-          <w:sz w:val="20"/>
-          <w:szCs w:val="20"/>
-        </w:rPr>
-        <w:t xml:space="preserve"> </w:t>
-      </w:r>
-      <w:proofErr w:type="spellStart"/>
-      <w:r>
-        <w:rPr>
-          <w:sz w:val="20"/>
-          <w:szCs w:val="20"/>
-        </w:rPr>
-        <w:t>dipergunakan</w:t>
-      </w:r>
-      <w:proofErr w:type="spellEnd"/>
-      <w:r>
-        <w:rPr>
-          <w:sz w:val="20"/>
-          <w:szCs w:val="20"/>
-        </w:rPr>
-        <w:t xml:space="preserve"> </w:t>
-      </w:r>
-      <w:proofErr w:type="spellStart"/>
-      <w:r>
-        <w:rPr>
-          <w:sz w:val="20"/>
-          <w:szCs w:val="20"/>
-        </w:rPr>
-        <w:t>sebagaimana</w:t>
-      </w:r>
-      <w:proofErr w:type="spellEnd"/>
-      <w:r>
-        <w:rPr>
-          <w:sz w:val="20"/>
-          <w:szCs w:val="20"/>
-        </w:rPr>
-        <w:t xml:space="preserve"> </w:t>
-      </w:r>
-      <w:proofErr w:type="spellStart"/>
-      <w:r>
-        <w:rPr>
-          <w:sz w:val="20"/>
-          <w:szCs w:val="20"/>
-        </w:rPr>
-        <w:t>mestinya</w:t>
-      </w:r>
-      <w:proofErr w:type="spellEnd"/>
-      <w:r>
-        <w:rPr>
-          <w:sz w:val="20"/>
-          <w:szCs w:val="20"/>
-        </w:rPr>
-        <w:t xml:space="preserve">, </w:t>
-      </w:r>
-      <w:proofErr w:type="spellStart"/>
-      <w:r>
-        <w:rPr>
-          <w:sz w:val="20"/>
-          <w:szCs w:val="20"/>
-        </w:rPr>
-        <w:t>antara</w:t>
-      </w:r>
-      <w:proofErr w:type="spellEnd"/>
-      <w:r>
-        <w:rPr>
-          <w:sz w:val="20"/>
-          <w:szCs w:val="20"/>
-        </w:rPr>
-        <w:t xml:space="preserve"> lain </w:t>
-      </w:r>
-      <w:proofErr w:type="spellStart"/>
-      <w:r>
-        <w:rPr>
-          <w:sz w:val="20"/>
-          <w:szCs w:val="20"/>
-        </w:rPr>
-        <w:t>sebagai</w:t>
-      </w:r>
-      <w:proofErr w:type="spellEnd"/>
-      <w:r>
-        <w:rPr>
-          <w:sz w:val="20"/>
-          <w:szCs w:val="20"/>
-        </w:rPr>
-        <w:t xml:space="preserve"> </w:t>
-      </w:r>
-      <w:proofErr w:type="spellStart"/>
-      <w:r>
-        <w:rPr>
-          <w:sz w:val="20"/>
-          <w:szCs w:val="20"/>
-        </w:rPr>
-        <w:t>bukti</w:t>
-      </w:r>
-      <w:proofErr w:type="spellEnd"/>
-      <w:r>
-        <w:rPr>
-          <w:sz w:val="20"/>
-          <w:szCs w:val="20"/>
-        </w:rPr>
-        <w:t xml:space="preserve"> </w:t>
-      </w:r>
-      <w:proofErr w:type="spellStart"/>
-      <w:r>
-        <w:rPr>
-          <w:sz w:val="20"/>
-          <w:szCs w:val="20"/>
-        </w:rPr>
-        <w:t>pengalaman</w:t>
-      </w:r>
-      <w:proofErr w:type="spellEnd"/>
-      <w:r>
-        <w:rPr>
-          <w:sz w:val="20"/>
-          <w:szCs w:val="20"/>
-        </w:rPr>
-        <w:t xml:space="preserve"> </w:t>
-      </w:r>
-      <w:proofErr w:type="spellStart"/>
-      <w:r>
-        <w:rPr>
-          <w:sz w:val="20"/>
-          <w:szCs w:val="20"/>
-        </w:rPr>
-        <w:t>dalam</w:t>
-      </w:r>
-      <w:proofErr w:type="spellEnd"/>
-      <w:r>
-        <w:rPr>
-          <w:sz w:val="20"/>
-          <w:szCs w:val="20"/>
-        </w:rPr>
-        <w:t xml:space="preserve"> proses </w:t>
-      </w:r>
-      <w:proofErr w:type="spellStart"/>
-      <w:r>
-        <w:rPr>
-          <w:sz w:val="20"/>
-          <w:szCs w:val="20"/>
-        </w:rPr>
-        <w:t>pengadaan</w:t>
-      </w:r>
-      <w:proofErr w:type="spellEnd"/>
-      <w:r>
-        <w:rPr>
-          <w:sz w:val="20"/>
-          <w:szCs w:val="20"/>
-        </w:rPr>
-        <w:t xml:space="preserve"> </w:t>
-      </w:r>
-      <w:proofErr w:type="spellStart"/>
-      <w:r>
-        <w:rPr>
-          <w:sz w:val="20"/>
-          <w:szCs w:val="20"/>
-        </w:rPr>
-        <w:t>jasa</w:t>
-      </w:r>
-      <w:proofErr w:type="spellEnd"/>
-      <w:r>
-        <w:rPr>
-          <w:sz w:val="20"/>
-          <w:szCs w:val="20"/>
-        </w:rPr>
-        <w:t xml:space="preserve"> </w:t>
-      </w:r>
-      <w:proofErr w:type="spellStart"/>
-      <w:r>
-        <w:rPr>
-          <w:sz w:val="20"/>
-          <w:szCs w:val="20"/>
-        </w:rPr>
-        <w:t>konsultansi</w:t>
-      </w:r>
-      <w:proofErr w:type="spellEnd"/>
-      <w:r>
-        <w:rPr>
-          <w:sz w:val="20"/>
-          <w:szCs w:val="20"/>
-        </w:rPr>
-        <w:t xml:space="preserve"> </w:t>
-      </w:r>
-      <w:proofErr w:type="spellStart"/>
-      <w:r>
-        <w:rPr>
-          <w:sz w:val="20"/>
-          <w:szCs w:val="20"/>
-        </w:rPr>
-        <w:t>konstruksi</w:t>
-      </w:r>
-      <w:proofErr w:type="spellEnd"/>
-      <w:r>
-        <w:rPr>
-          <w:sz w:val="20"/>
-          <w:szCs w:val="20"/>
-        </w:rPr>
-        <w:t>.</w:t>
+          <w:rFonts w:ascii="Arial" w:hAnsi="Arial" w:cs="Arial"/>
+          <w:sz w:val="20"/>
+          <w:szCs w:val="20"/>
+        </w:rPr>
+        <w:t>${teks_penutup_surat}</w:t>
       </w:r>
     </w:p>
     <w:p ns2:paraId="2D7EB004" ns2:textId="77777777">

</xml_diff>

<commit_message>
refactor: optimize document layout and styling to fit performance certificate into single page
</commit_message>
<xml_diff>
--- a/app/Views/admin/kontrak/surket_kinerja_ta_template.docx
+++ b/app/Views/admin/kontrak/surket_kinerja_ta_template.docx
@@ -88,30 +88,6 @@
         </w:rPr>
       </w:pPr>
     </w:p>
-    <w:p ns2:paraId="12BFF354" ns2:textId="77777777">
-      <w:pPr>
-        <w:spacing w:after="80"/>
-        <w:jc w:val="center"/>
-        <w:rPr>
-          <w:b/>
-          <w:bCs/>
-          <w:sz w:val="26"/>
-          <w:szCs w:val="26"/>
-        </w:rPr>
-      </w:pPr>
-    </w:p>
-    <w:p ns2:paraId="7365EEA3" ns2:textId="77777777">
-      <w:pPr>
-        <w:spacing w:after="80"/>
-        <w:jc w:val="center"/>
-        <w:rPr>
-          <w:b/>
-          <w:bCs/>
-          <w:sz w:val="26"/>
-          <w:szCs w:val="26"/>
-        </w:rPr>
-      </w:pPr>
-    </w:p>
     <w:p ns2:paraId="5A92333B" ns2:textId="09324B8C">
       <w:pPr>
         <w:spacing w:line="276" w:lineRule="auto"/>
@@ -2049,27 +2025,6 @@
         </w:tc>
       </w:tr>
     </w:tbl>
-    <w:p ns2:paraId="2F94D2AE" ns2:textId="77777777">
-      <w:pPr>
-        <w:spacing w:after="80"/>
-        <w:rPr>
-          <w:b/>
-          <w:bCs/>
-          <w:sz w:val="20"/>
-          <w:szCs w:val="20"/>
-        </w:rPr>
-      </w:pPr>
-    </w:p>
-    <w:p ns2:paraId="1B9DC6B6" ns2:textId="77777777">
-      <w:pPr>
-        <w:spacing w:after="200"/>
-        <w:jc w:val="both"/>
-        <w:rPr>
-          <w:sz w:val="20"/>
-          <w:szCs w:val="20"/>
-        </w:rPr>
-      </w:pPr>
-    </w:p>
     <w:p ns2:paraId="69E68842" ns2:textId="52999361">
       <w:pPr>
         <w:spacing w:after="200"/>
@@ -2087,12 +2042,6 @@
         </w:rPr>
         <w:t>${teks_penutup_surat}</w:t>
       </w:r>
-    </w:p>
-    <w:p ns2:paraId="2D7EB004" ns2:textId="77777777">
-      <w:pPr>
-        <w:spacing w:after="200"/>
-        <w:jc w:val="both"/>
-      </w:pPr>
     </w:p>
     <w:p ns2:paraId="4C062CEF" ns2:textId="1EDD5ABD">
       <w:pPr>
@@ -2230,42 +2179,6 @@
         </w:rPr>
       </w:pPr>
     </w:p>
-    <w:p ns2:paraId="6F6D7B5C" ns2:textId="77777777">
-      <w:pPr>
-        <w:pStyle w:val="BodyText"/>
-        <w:tabs>
-          <w:tab w:val="left" w:pos="6030"/>
-          <w:tab w:val="left" w:pos="7020"/>
-        </w:tabs>
-        <w:ind w:left="6237"/>
-        <w:jc w:val="center"/>
-        <w:rPr>
-          <w:rFonts w:ascii="Arial" w:hAnsi="Arial" w:cs="Arial"/>
-          <w:b/>
-          <w:sz w:val="20"/>
-          <w:szCs w:val="20"/>
-          <w:lang w:val="id-ID"/>
-        </w:rPr>
-      </w:pPr>
-    </w:p>
-    <w:p ns2:paraId="22FBDEB5" ns2:textId="77777777">
-      <w:pPr>
-        <w:pStyle w:val="BodyText"/>
-        <w:tabs>
-          <w:tab w:val="left" w:pos="6030"/>
-          <w:tab w:val="left" w:pos="7020"/>
-        </w:tabs>
-        <w:ind w:left="6237"/>
-        <w:jc w:val="center"/>
-        <w:rPr>
-          <w:rFonts w:ascii="Arial" w:hAnsi="Arial" w:cs="Arial"/>
-          <w:b/>
-          <w:sz w:val="20"/>
-          <w:szCs w:val="20"/>
-          <w:lang w:val="pt-BR"/>
-        </w:rPr>
-      </w:pPr>
-    </w:p>
     <w:p ns2:paraId="339B8F56" ns2:textId="77777777">
       <w:pPr>
         <w:ind w:left="6237"/>
@@ -2308,74 +2221,9 @@
         <w:t>NIP. ${ppk_tanda_tangan_nip}</w:t>
       </w:r>
     </w:p>
-    <w:p ns2:paraId="5AE03161" ns2:textId="79E3530F">
-      <w:pPr>
-        <w:jc w:val="right"/>
-        <w:rPr>
-          <w:sz w:val="20"/>
-          <w:szCs w:val="20"/>
-        </w:rPr>
-      </w:pPr>
-    </w:p>
-    <w:p ns2:paraId="034DB9BE" ns2:textId="77777777">
-      <w:pPr>
-        <w:jc w:val="right"/>
-        <w:rPr>
-          <w:sz w:val="20"/>
-          <w:szCs w:val="20"/>
-        </w:rPr>
-      </w:pPr>
-    </w:p>
-    <w:p ns2:paraId="14E50C70" ns2:textId="77777777">
-      <w:pPr>
-        <w:jc w:val="right"/>
-        <w:rPr>
-          <w:sz w:val="20"/>
-          <w:szCs w:val="20"/>
-        </w:rPr>
-      </w:pPr>
-    </w:p>
-    <w:p ns2:paraId="4C67A378" ns2:textId="77777777">
-      <w:pPr>
-        <w:jc w:val="right"/>
-        <w:rPr>
-          <w:sz w:val="20"/>
-          <w:szCs w:val="20"/>
-        </w:rPr>
-      </w:pPr>
-    </w:p>
-    <w:p ns2:paraId="29708FCC" ns2:textId="77777777">
-      <w:pPr>
-        <w:jc w:val="right"/>
-        <w:rPr>
-          <w:sz w:val="20"/>
-          <w:szCs w:val="20"/>
-        </w:rPr>
-      </w:pPr>
-    </w:p>
-    <w:p ns2:paraId="3B6E3442" ns2:textId="77777777">
-      <w:pPr>
-        <w:jc w:val="right"/>
-        <w:rPr>
-          <w:sz w:val="20"/>
-          <w:szCs w:val="20"/>
-        </w:rPr>
-      </w:pPr>
-    </w:p>
-    <w:p ns2:paraId="2489DC2E" ns2:textId="77777777">
-      <w:pPr>
-        <w:spacing w:line="276" w:lineRule="auto"/>
-        <w:rPr>
-          <w:b/>
-          <w:bCs/>
-          <w:sz w:val="26"/>
-          <w:szCs w:val="26"/>
-        </w:rPr>
-      </w:pPr>
-    </w:p>
     <w:sectPr>
       <w:pgSz w:w="11906" w:h="16838"/>
-      <w:pgMar w:top="800" w:right="849" w:bottom="700" w:left="1300" w:header="708" w:footer="708" w:gutter="0"/>
+      <w:pgMar w:top="650" w:right="850" w:bottom="500" w:left="1134" w:header="708" w:footer="708" w:gutter="0"/>
       <w:cols w:space="720"/>
       <w:docGrid w:linePitch="360"/>
     </w:sectPr>

</xml_diff>